<commit_message>
docs(internship-tracking): cover Open WebUI validation and citation cleanup
The previous docs commit landed before the frontend path was validated,
so it undercounted the work. Corrects the bug count from two to four
(adding the missing Open WebUI Pipe Function and the browser
answer-parsing bug), moves the browser walkthrough from Pending to
Completed now that it is verified, and adds Tasks 16-17 covering
frontend validation and the citation display cleanup.
</commit_message>
<xml_diff>
--- a/internship-tracking/1_month_roadmap.docx
+++ b/internship-tracking/1_month_roadmap.docx
@@ -226,7 +226,33 @@
         <w:spacing w:after="60"/>
       </w:pPr>
       <w:r>
-        <w:t>Found and fixed two bugs surfaced by that first real ingestion: a document-visibility bug (--public flag not reliably reaching the server) and a background-task session bug that silently broke keyword search after every ingestion</w:t>
+        <w:t>Found and fixed four bugs across the ingestion and frontend paths: a document-visibility bug (--public flag not reliably reaching the server), a background-task session bug that silently broke keyword search after every ingestion, a missing Open WebUI Pipe Function on the new server, and an answer-parsing bug that rendered browser answers as sources with no answer text</w:t>
+      </w:r>
+    </w:p>
+    <w:p>
+      <w:pPr>
+        <w:pStyle w:val="ListParagraph"/>
+        <w:numPr>
+          <w:ilvl w:val="0"/>
+          <w:numId w:val="1"/>
+        </w:numPr>
+        <w:spacing w:after="60"/>
+      </w:pPr>
+      <w:r>
+        <w:t>Validated the Open WebUI browser chat path on the production server end-to-end, including access control, retrieval, and citation rendering</w:t>
+      </w:r>
+    </w:p>
+    <w:p>
+      <w:pPr>
+        <w:pStyle w:val="ListParagraph"/>
+        <w:numPr>
+          <w:ilvl w:val="0"/>
+          <w:numId w:val="1"/>
+        </w:numPr>
+        <w:spacing w:after="60"/>
+      </w:pPr>
+      <w:r>
+        <w:t>Cleaned up citation display so sources list one entry per document rather than one per retrieved chunk, while keeping the full citation trail in the API response and audit log</w:t>
       </w:r>
     </w:p>
     <w:p>

</xml_diff>

<commit_message>
docs(roadmap): record the 19/08 work and remove two stray scratch files
Both roadmaps track delivery with "Completed <date>" markers, and Month 2
of the three-month plan is the security phase, so today's work belongs in
both rather than only in the daily logs.

Marks the prompt-injection testing and the per-conversation upload as
delivered, adds the export-delivery and conversation-identity fixes, and
marks "move document upload into Open WebUI" as superseded — the
administrator is getting a dedicated interface instead, so the chat
window is no longer the destination for it.

Also removes internship-tracking/structure.txt and targets.txt. They
were scratch dumps I used to read the .docx structure and they were swept
into the previous commit by `git add -A`. They were never intended to be
tracked.

Co-Authored-By: Claude Opus 5 (1M context) <noreply@anthropic.com>
</commit_message>
<xml_diff>
--- a/internship-tracking/1_month_roadmap.docx
+++ b/internship-tracking/1_month_roadmap.docx
@@ -515,7 +515,7 @@
         <w:spacing w:after="60"/>
       </w:pPr>
       <w:r>
-        <w:t>Execute the authored prompt-injection/security test cases against the now-live pipeline</w:t>
+        <w:t>Completed Aug 19 — Executed the authored prompt-injection and security test cases against the live pipeline. It failed three of them: it obeyed instructions written inside a document's contents, printed its own operating instructions on request, and complied with a plain instruction to disregard its rules. All three are fixed; the suite went from eleven passing and four failing to eighteen passing and none failing. Access control held throughout, before and after the fix</w:t>
       </w:r>
     </w:p>
     <w:p>
@@ -542,15 +542,15 @@
         <w:pStyle w:val="ListParagraph"/>
       </w:pPr>
       <w:r>
-        <w:t>Per-chat file upload with session-scoped retrieval — let a user attach a file to a conversation and question it. Blocked today by access control rather than parsing: pilot users resolve to full access, so a session document would be visible to every user (week of Aug 17)</w:t>
-      </w:r>
-    </w:p>
-    <w:p>
-      <w:pPr>
-        <w:pStyle w:val="ListParagraph"/>
-      </w:pPr>
-      <w:r>
-        <w:t>Move document upload and withdrawal into Open WebUI, so they happen in the same interface as the chat rather than through the API documentation page (week of Aug 17)</w:t>
+        <w:t>Completed Aug 19 — Per-conversation file upload with scoped access, delivered end to end: attach, question, list, withdraw, plus an administrator view and an automatic reclamation process. Isolation demonstrated with the live model, including that a second account holding the correct conversation identifier retrieves nothing</w:t>
+      </w:r>
+    </w:p>
+    <w:p>
+      <w:pPr>
+        <w:pStyle w:val="ListParagraph"/>
+      </w:pPr>
+      <w:r>
+        <w:t>Superseded Aug 19 — moving upload into the chat interface is no longer the intended destination; the administrator is to get a dedicated interface for uploading, withdrawing and reviewing the audit log instead</w:t>
       </w:r>
     </w:p>
     <w:sectPr>
@@ -635,6 +635,38 @@
       </w:pPr>
       <w:r>
         <w:t>Found Aug 18, open — Docker publishes container ports past the host firewall, leaving Postgres, Redis, Qdrant, MinIO, the API and the frontend reachable from the office LAN, with Qdrant answering unauthenticated callers. Confirmed from a second machine. Needs a DOCKER-USER rule and an API key before the pilot widens.</w:t>
+      </w:r>
+    </w:p>
+    <w:p>
+      <w:pPr>
+        <w:pStyle w:val="ListParagraph"/>
+      </w:pPr>
+      <w:r>
+        <w:t>Completed Aug 19 — Closed the file-export delivery gap. The generated Word or Excel file is now stored and the reply carries a link that works from a browser. Previously the file was built, returned internally and discarded while the assistant reported success</w:t>
+      </w:r>
+    </w:p>
+    <w:p>
+      <w:pPr>
+        <w:pStyle w:val="ListParagraph"/>
+      </w:pPr>
+      <w:r>
+        <w:t>Completed Aug 19 — Corrected a recorded diagnosis rather than acting on it: the export feature was logged as a broken model integration, and layer-by-layer testing showed the model and the file generators both work and only delivery was missing</w:t>
+      </w:r>
+    </w:p>
+    <w:p>
+      <w:pPr>
+        <w:pStyle w:val="ListParagraph"/>
+      </w:pPr>
+      <w:r>
+        <w:t>Completed Aug 19 — Fixed a defect where one conversation's history was being read back as context inside another, because conversations were identified by the person rather than by the conversation</w:t>
+      </w:r>
+    </w:p>
+    <w:p>
+      <w:pPr>
+        <w:pStyle w:val="ListParagraph"/>
+      </w:pPr>
+      <w:r>
+        <w:t>Completed Aug 19 — Enabled the per-conversation upload control in the interface, having held it back until both the isolation and the injection defences were demonstrated rather than merely written</w:t>
       </w:r>
     </w:p>
     <w:p>

</xml_diff>

<commit_message>
docs(tracking): record 20/08 work and the ERP-side capacity blocker
Adds the image-handling finding, the future-scope record and the
settled admin UI scope to the deployment status and both roadmaps.

Records two new blockers: Dhruv's machine lacks the RAM/VRAM to run
the enterprise half at a workable speed, and the two halves being
developed on separate machines carries a coordination cost that is
the stated reason the admin interface is planned but not started.

Corrects FUTURE_SCOPE.md, which had cited the MinIO persistence and
download route as a prerequisite for image delivery. That landed on
19/08 with file export, so it is a pattern to copy rather than
something to wait for. CLAUDE.md still lists it as an open defect
and needs the same correction.

Co-Authored-By: Claude Opus 5 (1M context) <noreply@anthropic.com>
</commit_message>
<xml_diff>
--- a/internship-tracking/1_month_roadmap.docx
+++ b/internship-tracking/1_month_roadmap.docx
@@ -771,6 +771,71 @@
       </w:pPr>
       <w:r>
         <w:t>Completed Aug 19 — Fixed two pre-existing faults, either of which would have stopped the first step of loading the testers' documents. Every document upload raised AttributeError, because a method had drifted out of the ingestion class during an earlier refactor and become an unreachable nested function. Separately the administrator ingest CLI could not parse a single argument, because Typer 0.12 against the resolved click 8.2 raises before parsing. Both were invisible to the test suite, which passed throughout; a structural test now covers the first, and all three CLIs moved to argparse for the second.</w:t>
+      </w:r>
+    </w:p>
+    <w:p>
+      <w:pPr>
+        <w:pStyle w:val="ListParagraph"/>
+        <w:numPr>
+          <w:ilvl w:val="0"/>
+          <w:numId w:val="1"/>
+        </w:numPr>
+        <w:spacing w:after="60"/>
+      </w:pPr>
+      <w:r>
+        <w:t>Completed Aug 20 — Established what happens to an image inside a source document, before building anything that would depend on it. Images are discarded at parse time in every supported format, silently: the Word reader never walks the elements that hold pictures, the Excel reader records a chart's title but not the chart, and a scanned PDF page is turned into text by OCR and the pixels dropped. No error is raised and the stored chunk holds no reference to what was lost, and there is no field on that record capable of holding an image — so this is a gap in the data model rather than a wiring mistake.</w:t>
+      </w:r>
+    </w:p>
+    <w:p>
+      <w:pPr>
+        <w:pStyle w:val="ListParagraph"/>
+        <w:numPr>
+          <w:ilvl w:val="0"/>
+          <w:numId w:val="1"/>
+        </w:numPr>
+        <w:spacing w:after="60"/>
+      </w:pPr>
+      <w:r>
+        <w:t>Completed Aug 20 — Recorded the project's deferred work in a single future-scope document, each item with the reason it is not being started yet, covering image handling in both of its possible forms, the administrator interface, and the pilot's system switch. Returning the picture beside the retrieved text needs parse-time work and a field on the chunk record but no new infrastructure, since the storage and single-file download link built for file export on Aug 19 are the same pattern. Having the assistant read an image and answer from it needs a vision-capable model on a card already shared three ways, and is not committed to.</w:t>
+      </w:r>
+    </w:p>
+    <w:p>
+      <w:pPr>
+        <w:pStyle w:val="ListParagraph"/>
+        <w:numPr>
+          <w:ilvl w:val="0"/>
+          <w:numId w:val="1"/>
+        </w:numPr>
+        <w:spacing w:after="60"/>
+      </w:pPr>
+      <w:r>
+        <w:t>Completed Aug 20 — Scoped the administrator interface against what already exists and established it needs almost no new backend work: upload, listing, withdrawal and permission editing are live, and the only gap is an authenticated route to download an original file, whose retrieval code is present but called by nothing. It stays a client of the API and never reaches storage directly, which is what keeps the exposure closed on Aug 19 shut. Limited deliberately to document management for this pass. The build is held pending coordination with Dhruv rather than started solo, since work across the boundary between the two halves would need redoing once agreed.</w:t>
+      </w:r>
+    </w:p>
+    <w:p>
+      <w:pPr>
+        <w:pStyle w:val="ListParagraph"/>
+        <w:numPr>
+          <w:ilvl w:val="0"/>
+          <w:numId w:val="1"/>
+        </w:numPr>
+        <w:spacing w:after="60"/>
+      </w:pPr>
+      <w:r>
+        <w:t>Planned Aug 20 — A manual switch in the chat interface between this assistant and the ERP integration, for the pilot period only, so a tester can choose which system answers. It cannot be built before there is a second system to switch to, the enterprise agent still being an abstract contract with no implementation. The intended end state is routing that infers which system a question belongs to, so this is explicitly a temporary measure.</w:t>
+      </w:r>
+    </w:p>
+    <w:p>
+      <w:pPr>
+        <w:pStyle w:val="ListParagraph"/>
+        <w:numPr>
+          <w:ilvl w:val="0"/>
+          <w:numId w:val="1"/>
+        </w:numPr>
+        <w:spacing w:after="60"/>
+      </w:pPr>
+      <w:r>
+        <w:t>Carried forward — a tester instruction manual pitched at first-time users of a system of this kind, covering how to open the interface, ask a question and attach a file, and equally what the pilot cannot yet do, so an absent capability is not reported as a fault.</w:t>
       </w:r>
     </w:p>
     <w:p>

</xml_diff>